<commit_message>
README und Prompt-Doku an den tatsächlichen Stand angepasst: - StepStone-, WordPress- und Webapp-Prototypen aufgeführt - Mock-Server als manuell gestartet beschrieben (nicht Teil von pytest) - Anthropic-API-Aufruf und Grenzen der Schema-Prüfung korrekt dargestellt
README und Prompt-Doku an den tatsächlichen Stand angepasst:
- StepStone-, WordPress- und Webapp-Prototypen aufgeführt
- Mock-Server als manuell gestartet beschrieben (nicht Teil von pytest)
- Anthropic-API-Aufruf und Grenzen der Schema-Prüfung korrekt dargestellt
</commit_message>
<xml_diff>
--- a/templates/template.docx
+++ b/templates/template.docx
@@ -106,6 +106,20 @@
             </w:r>
           </w:p>
           <w:p>
+            <w:pPr>
+              <w:spacing w:after="40"/>
+            </w:pPr>
+            <w:r>
+              <w:t>{{ agency_street }}</w:t>
+            </w:r>
+            <w:r>
+              <w:br/>
+            </w:r>
+            <w:r>
+              <w:t>{{ agency_zip_city }}</w:t>
+            </w:r>
+          </w:p>
+          <w:p>
             <w:r>
               <w:rPr>
                 <w:color w:val="6E6E6E"/>
@@ -422,7 +436,7 @@
           <w:bCs/>
           <w:color w:val="FFFFFF"/>
         </w:rPr>
-        <w:t xml:space="preserve">  Interessiert an der Position als {{ job_title }} (m/w/d)? Bewerben Sie sich jetzt in wenigen Minuten.  </w:t>
+        <w:t xml:space="preserve">  Interessiert an der Position als {{ job_title_clean }} (m/w/d)? Bewerben Sie sich jetzt in wenigen Minuten.  </w:t>
       </w:r>
     </w:p>
     <w:sectPr>
@@ -537,44 +551,7 @@
 <w:hdr xmlns:wpc="http://schemas.microsoft.com/office/word/2010/wordprocessingCanvas" xmlns:mc="http://schemas.openxmlformats.org/markup-compatibility/2006" xmlns:o="urn:schemas-microsoft-com:office:office" xmlns:r="http://schemas.openxmlformats.org/officeDocument/2006/relationships" xmlns:m="http://schemas.openxmlformats.org/officeDocument/2006/math" xmlns:v="urn:schemas-microsoft-com:vml" xmlns:wp14="http://schemas.microsoft.com/office/word/2010/wordprocessingDrawing" xmlns:wp="http://schemas.openxmlformats.org/drawingml/2006/wordprocessingDrawing" xmlns:w10="urn:schemas-microsoft-com:office:word" xmlns:w="http://schemas.openxmlformats.org/wordprocessingml/2006/main" xmlns:w14="http://schemas.microsoft.com/office/word/2010/wordml" xmlns:w15="http://schemas.microsoft.com/office/word/2012/wordml" xmlns:wpg="http://schemas.microsoft.com/office/word/2010/wordprocessingGroup" xmlns:wpi="http://schemas.microsoft.com/office/word/2010/wordprocessingInk" xmlns:wne="http://schemas.microsoft.com/office/word/2006/wordml" xmlns:wps="http://schemas.microsoft.com/office/word/2010/wordprocessingShape" xmlns:cx="http://schemas.microsoft.com/office/drawing/2014/chartex" xmlns:cx1="http://schemas.microsoft.com/office/drawing/2015/9/8/chartex" xmlns:cx2="http://schemas.microsoft.com/office/drawing/2015/10/21/chartex" xmlns:cx3="http://schemas.microsoft.com/office/drawing/2016/5/9/chartex" xmlns:cx4="http://schemas.microsoft.com/office/drawing/2016/5/10/chartex" xmlns:cx5="http://schemas.microsoft.com/office/drawing/2016/5/11/chartex" xmlns:cx6="http://schemas.microsoft.com/office/drawing/2016/5/12/chartex" xmlns:cx7="http://schemas.microsoft.com/office/drawing/2016/5/13/chartex" xmlns:cx8="http://schemas.microsoft.com/office/drawing/2016/5/14/chartex" xmlns:w16cid="http://schemas.microsoft.com/office/word/2016/wordml/cid" xmlns:w16se="http://schemas.microsoft.com/office/word/2015/wordml/symex">
   <w:p>
     <w:r>
-      <w:drawing>
-        <wp:inline distT="0" distB="0" distL="0" distR="0">
-          <wp:extent cx="1143000" cy="304800"/>
-          <wp:effectExtent t="0" r="0" b="0" l="0"/>
-          <wp:docPr id="1" name="" descr="" title=""/>
-          <wp:cNvGraphicFramePr>
-            <a:graphicFrameLocks xmlns:a="http://schemas.openxmlformats.org/drawingml/2006/main" noChangeAspect="1"/>
-          </wp:cNvGraphicFramePr>
-          <a:graphic xmlns:a="http://schemas.openxmlformats.org/drawingml/2006/main">
-            <a:graphicData uri="http://schemas.openxmlformats.org/drawingml/2006/picture">
-              <pic:pic xmlns:pic="http://schemas.openxmlformats.org/drawingml/2006/picture">
-                <pic:nvPicPr>
-                  <pic:cNvPr id="0" name="" descr=""/>
-                  <pic:cNvPicPr>
-                    <a:picLocks noChangeAspect="1" noChangeArrowheads="1"/>
-                  </pic:cNvPicPr>
-                </pic:nvPicPr>
-                <pic:blipFill>
-                  <a:blip r:embed="rId0" cstate="none"/>
-                  <a:srcRect/>
-                  <a:stretch>
-                    <a:fillRect/>
-                  </a:stretch>
-                </pic:blipFill>
-                <pic:spPr bwMode="auto">
-                  <a:xfrm>
-                    <a:off x="0" y="0"/>
-                    <a:ext cx="1143000" cy="304800"/>
-                  </a:xfrm>
-                  <a:prstGeom prst="rect">
-                    <a:avLst/>
-                  </a:prstGeom>
-                </pic:spPr>
-              </pic:pic>
-            </a:graphicData>
-          </a:graphic>
-        </wp:inline>
-      </w:drawing>
+      <w:t>{{agency_logo}}</w:t>
     </w:r>
   </w:p>
 </w:hdr>

</xml_diff>